<commit_message>
added tavily search function
</commit_message>
<xml_diff>
--- a/Personal Information.docx
+++ b/Personal Information.docx
@@ -465,23 +465,7 @@
           <w:bCs/>
         </w:rPr>
         <w:lastRenderedPageBreak/>
-        <w:t xml:space="preserve">in 2006, Verizon bought MCI, then Sanjay worked there until 2015 with many </w:t>
-      </w:r>
-      <w:proofErr w:type="gramStart"/>
-      <w:r>
-        <w:rPr>
-          <w:b/>
-          <w:bCs/>
-        </w:rPr>
-        <w:t>manager</w:t>
-      </w:r>
-      <w:proofErr w:type="gramEnd"/>
-      <w:r>
-        <w:rPr>
-          <w:b/>
-          <w:bCs/>
-        </w:rPr>
-        <w:t xml:space="preserve"> like Sherry Major, Sherry Skipper, Frank Hayes and Chris Monaco.</w:t>
+        <w:t>in 2006, Verizon bought MCI, then Sanjay worked there until 2015 with many manager like Sherry Major, Sherry Skipper, Frank Hayes and Chris Monaco.</w:t>
       </w:r>
     </w:p>
     <w:p>
@@ -1334,15 +1318,7 @@
           <w:bCs/>
         </w:rPr>
         <w:lastRenderedPageBreak/>
-        <w:t xml:space="preserve">He is </w:t>
-      </w:r>
-      <w:proofErr w:type="gramStart"/>
-      <w:r>
-        <w:rPr>
-          <w:b/>
-          <w:bCs/>
-        </w:rPr>
-        <w:t xml:space="preserve">selected </w:t>
+        <w:t xml:space="preserve">He is selected </w:t>
       </w:r>
       <w:r>
         <w:rPr>
@@ -1356,15 +1332,7 @@
           <w:b/>
           <w:bCs/>
         </w:rPr>
-        <w:t>to</w:t>
-      </w:r>
-      <w:proofErr w:type="gramEnd"/>
-      <w:r>
-        <w:rPr>
-          <w:b/>
-          <w:bCs/>
-        </w:rPr>
-        <w:t xml:space="preserve"> do </w:t>
+        <w:t xml:space="preserve">to do </w:t>
       </w:r>
       <w:r>
         <w:rPr>
@@ -1456,37 +1424,12 @@
           <w:bCs/>
         </w:rPr>
       </w:pPr>
-      <w:proofErr w:type="gramStart"/>
-      <w:r>
-        <w:rPr>
-          <w:b/>
-          <w:bCs/>
-        </w:rPr>
-        <w:t>Currently</w:t>
-      </w:r>
-      <w:proofErr w:type="gramEnd"/>
-      <w:r>
-        <w:rPr>
-          <w:b/>
-          <w:bCs/>
-        </w:rPr>
-        <w:t xml:space="preserve"> working as </w:t>
-      </w:r>
-      <w:proofErr w:type="gramStart"/>
-      <w:r>
-        <w:rPr>
-          <w:b/>
-          <w:bCs/>
-        </w:rPr>
-        <w:t>Technology</w:t>
-      </w:r>
-      <w:proofErr w:type="gramEnd"/>
-      <w:r>
-        <w:rPr>
-          <w:b/>
-          <w:bCs/>
-        </w:rPr>
-        <w:t xml:space="preserve"> Consultant at </w:t>
+      <w:r>
+        <w:rPr>
+          <w:b/>
+          <w:bCs/>
+        </w:rPr>
+        <w:t xml:space="preserve">Currently working as Technology Consultant at </w:t>
       </w:r>
       <w:proofErr w:type="spellStart"/>
       <w:r>
@@ -1777,23 +1720,7 @@
           <w:b/>
           <w:bCs/>
         </w:rPr>
-        <w:t xml:space="preserve">Name: Gelle (Bird, </w:t>
-      </w:r>
-      <w:proofErr w:type="gramStart"/>
-      <w:r>
-        <w:rPr>
-          <w:b/>
-          <w:bCs/>
-        </w:rPr>
-        <w:t>Parakeet) —</w:t>
-      </w:r>
-      <w:proofErr w:type="gramEnd"/>
-      <w:r>
-        <w:rPr>
-          <w:b/>
-          <w:bCs/>
-        </w:rPr>
-        <w:t xml:space="preserve"> playful and friendly personality</w:t>
+        <w:t>Name: Gelle (Bird, Parakeet) — playful and friendly personality</w:t>
       </w:r>
     </w:p>
     <w:p>
@@ -1840,23 +1767,7 @@
           <w:b/>
           <w:bCs/>
         </w:rPr>
-        <w:t xml:space="preserve">Daily Routine: Focused on balancing work and personal life; mornings dedicated to health and mindfulness, work on </w:t>
-      </w:r>
-      <w:proofErr w:type="gramStart"/>
-      <w:r>
-        <w:rPr>
-          <w:b/>
-          <w:bCs/>
-        </w:rPr>
-        <w:t>technology</w:t>
-      </w:r>
-      <w:proofErr w:type="gramEnd"/>
-      <w:r>
-        <w:rPr>
-          <w:b/>
-          <w:bCs/>
-        </w:rPr>
-        <w:t xml:space="preserve"> innovations, evenings spent with family and hobbies.</w:t>
+        <w:t>Daily Routine: Focused on balancing work and personal life; mornings dedicated to health and mindfulness, work on technology innovations, evenings spent with family and hobbies.</w:t>
       </w:r>
     </w:p>
     <w:p>
@@ -1940,114 +1851,32 @@
           <w:b/>
           <w:bCs/>
         </w:rPr>
-        <w:t xml:space="preserve">Friends: Sanjay Dubey have many family friends all over the USA and India. He also </w:t>
-      </w:r>
-      <w:proofErr w:type="gramStart"/>
-      <w:r>
-        <w:rPr>
-          <w:b/>
-          <w:bCs/>
-        </w:rPr>
-        <w:t>have</w:t>
-      </w:r>
-      <w:proofErr w:type="gramEnd"/>
-      <w:r>
-        <w:rPr>
-          <w:b/>
-          <w:bCs/>
-        </w:rPr>
-        <w:t xml:space="preserve"> many tennis buddies and professional friends all over </w:t>
-      </w:r>
-      <w:proofErr w:type="gramStart"/>
-      <w:r>
-        <w:rPr>
-          <w:b/>
-          <w:bCs/>
-        </w:rPr>
-        <w:t>USA</w:t>
-      </w:r>
-      <w:proofErr w:type="gramEnd"/>
-      <w:r>
-        <w:rPr>
-          <w:b/>
-          <w:bCs/>
-        </w:rPr>
-        <w:t>.</w:t>
-      </w:r>
-    </w:p>
-    <w:p>
-      <w:pPr>
-        <w:rPr>
-          <w:b/>
-          <w:bCs/>
-        </w:rPr>
-      </w:pPr>
-    </w:p>
-    <w:p>
-      <w:r>
-        <w:rPr>
-          <w:b/>
-          <w:bCs/>
-        </w:rPr>
-        <w:t xml:space="preserve">Cousins: Sanjay Dubey </w:t>
-      </w:r>
-      <w:proofErr w:type="gramStart"/>
-      <w:r>
-        <w:rPr>
-          <w:b/>
-          <w:bCs/>
-        </w:rPr>
-        <w:t>have</w:t>
-      </w:r>
-      <w:proofErr w:type="gramEnd"/>
-      <w:r>
-        <w:rPr>
-          <w:b/>
-          <w:bCs/>
-        </w:rPr>
-        <w:t xml:space="preserve"> </w:t>
-      </w:r>
-      <w:proofErr w:type="gramStart"/>
-      <w:r>
-        <w:rPr>
-          <w:b/>
-          <w:bCs/>
-        </w:rPr>
-        <w:t>big</w:t>
-      </w:r>
-      <w:proofErr w:type="gramEnd"/>
-      <w:r>
-        <w:rPr>
-          <w:b/>
-          <w:bCs/>
-        </w:rPr>
-        <w:t xml:space="preserve"> extended </w:t>
-      </w:r>
-      <w:proofErr w:type="gramStart"/>
-      <w:r>
-        <w:rPr>
-          <w:b/>
-          <w:bCs/>
-        </w:rPr>
-        <w:t>family,</w:t>
-      </w:r>
-      <w:proofErr w:type="gramEnd"/>
-      <w:r>
-        <w:rPr>
-          <w:b/>
-          <w:bCs/>
-        </w:rPr>
-        <w:t xml:space="preserve"> he has many aunts and uncles.  We </w:t>
-      </w:r>
-      <w:proofErr w:type="spellStart"/>
-      <w:r>
-        <w:rPr>
-          <w:b/>
-          <w:bCs/>
-        </w:rPr>
-        <w:t>donot</w:t>
-      </w:r>
-      <w:proofErr w:type="spellEnd"/>
+        <w:t>Friends: Sanjay Dubey have many family friends all over the USA and India. He also have many tennis buddies and professional friends all over USA.</w:t>
+      </w:r>
+    </w:p>
+    <w:p>
+      <w:pPr>
+        <w:rPr>
+          <w:b/>
+          <w:bCs/>
+        </w:rPr>
+      </w:pPr>
+    </w:p>
+    <w:p>
+      <w:r>
+        <w:rPr>
+          <w:b/>
+          <w:bCs/>
+        </w:rPr>
+        <w:t xml:space="preserve">Cousins: Sanjay Dubey have big extended family, he has many aunts and uncles.  We </w:t>
+      </w:r>
+      <w:r>
+        <w:rPr>
+          <w:b/>
+          <w:bCs/>
+        </w:rPr>
+        <w:t>don’t</w:t>
+      </w:r>
       <w:r>
         <w:rPr>
           <w:b/>

</xml_diff>